<commit_message>
docs: add CEP research submission documents, consent forms, and instruments
</commit_message>
<xml_diff>
--- a/01_Submissao_CEP_Palmilha_PPC/TERMO DE ANUÊNCIA INSTITUCIONAL e vinculo do pesquisador principal.docx
+++ b/01_Submissao_CEP_Palmilha_PPC/TERMO DE ANUÊNCIA INSTITUCIONAL e vinculo do pesquisador principal.docx
@@ -137,223 +137,7 @@
         </w:rPr>
       </w:pPr>
       <w:r>
-        <w:rPr>
-          <w:rFonts w:ascii="Arial" w:eastAsia="Arial" w:hAnsi="Arial" w:cs="Arial"/>
-          <w:sz w:val="18"/>
-          <w:szCs w:val="18"/>
-        </w:rPr>
-        <w:t xml:space="preserve">Declaro para os devidos fins que </w:t>
-      </w:r>
-      <w:r>
-        <w:rPr>
-          <w:rFonts w:ascii="Arial" w:eastAsia="Arial" w:hAnsi="Arial" w:cs="Arial"/>
-          <w:sz w:val="18"/>
-          <w:szCs w:val="18"/>
-        </w:rPr>
-        <w:t xml:space="preserve">o </w:t>
-      </w:r>
-      <w:r>
-        <w:rPr>
-          <w:rFonts w:ascii="Arial" w:eastAsia="Arial" w:hAnsi="Arial" w:cs="Arial"/>
-          <w:sz w:val="18"/>
-          <w:szCs w:val="18"/>
-        </w:rPr>
-        <w:t xml:space="preserve">Laboratório de </w:t>
-      </w:r>
-      <w:proofErr w:type="spellStart"/>
-      <w:r>
-        <w:rPr>
-          <w:rFonts w:ascii="Arial" w:eastAsia="Arial" w:hAnsi="Arial" w:cs="Arial"/>
-          <w:sz w:val="18"/>
-          <w:szCs w:val="18"/>
-        </w:rPr>
-        <w:t>Podoposturologia</w:t>
-      </w:r>
-      <w:proofErr w:type="spellEnd"/>
-      <w:r>
-        <w:rPr>
-          <w:rFonts w:ascii="Arial" w:eastAsia="Arial" w:hAnsi="Arial" w:cs="Arial"/>
-          <w:sz w:val="18"/>
-          <w:szCs w:val="18"/>
-        </w:rPr>
-        <w:t xml:space="preserve"> e Confecção de Palmilhas</w:t>
-      </w:r>
-      <w:r>
-        <w:rPr>
-          <w:rFonts w:ascii="Arial" w:eastAsia="Arial" w:hAnsi="Arial" w:cs="Arial"/>
-          <w:sz w:val="18"/>
-          <w:szCs w:val="18"/>
-        </w:rPr>
-        <w:t xml:space="preserve"> </w:t>
-      </w:r>
-      <w:r>
-        <w:rPr>
-          <w:rFonts w:ascii="Arial" w:eastAsia="Arial" w:hAnsi="Arial" w:cs="Arial"/>
-          <w:sz w:val="18"/>
-          <w:szCs w:val="18"/>
-        </w:rPr>
-        <w:t xml:space="preserve">da </w:t>
-      </w:r>
-      <w:r>
-        <w:rPr>
-          <w:rFonts w:ascii="Arial" w:eastAsia="Arial" w:hAnsi="Arial" w:cs="Arial"/>
-          <w:sz w:val="18"/>
-          <w:szCs w:val="18"/>
-          <w:lang w:val="en-US"/>
-        </w:rPr>
-        <w:t>POLICLÍNICA PIQUET CARNEIRO (PPC) do COMPLEXO HUPE/UERJ</w:t>
-      </w:r>
-      <w:r>
-        <w:rPr>
-          <w:rFonts w:ascii="Arial" w:eastAsia="Arial" w:hAnsi="Arial" w:cs="Arial"/>
-          <w:sz w:val="18"/>
-          <w:szCs w:val="18"/>
-        </w:rPr>
-        <w:t xml:space="preserve">, sabe do interesse e estamos de acordo com a condução na realização da Pesquisa: </w:t>
-      </w:r>
-      <w:r>
-        <w:rPr>
-          <w:rFonts w:ascii="Arial" w:eastAsia="Arial" w:hAnsi="Arial" w:cs="Arial"/>
-          <w:smallCaps/>
-          <w:sz w:val="18"/>
-          <w:szCs w:val="18"/>
-        </w:rPr>
-        <w:t>(</w:t>
-      </w:r>
-      <w:r>
-        <w:rPr>
-          <w:rFonts w:ascii="Arial" w:eastAsia="Arial" w:hAnsi="Arial" w:cs="Arial"/>
-          <w:sz w:val="18"/>
-          <w:szCs w:val="18"/>
-        </w:rPr>
-        <w:t xml:space="preserve">Arquitetura de baixo custo para monitoramento preventivo do pé diabético: proposta de sistema com sensores e modelo preditivo baseado em </w:t>
-      </w:r>
-      <w:proofErr w:type="spellStart"/>
-      <w:r>
-        <w:rPr>
-          <w:rFonts w:ascii="Arial" w:eastAsia="Arial" w:hAnsi="Arial" w:cs="Arial"/>
-          <w:sz w:val="18"/>
-          <w:szCs w:val="18"/>
-        </w:rPr>
-        <w:t>Random</w:t>
-      </w:r>
-      <w:proofErr w:type="spellEnd"/>
-      <w:r>
-        <w:rPr>
-          <w:rFonts w:ascii="Arial" w:eastAsia="Arial" w:hAnsi="Arial" w:cs="Arial"/>
-          <w:sz w:val="18"/>
-          <w:szCs w:val="18"/>
-        </w:rPr>
-        <w:t xml:space="preserve"> Forest</w:t>
-      </w:r>
-      <w:r>
-        <w:rPr>
-          <w:rFonts w:ascii="Arial" w:eastAsia="Arial" w:hAnsi="Arial" w:cs="Arial"/>
-          <w:smallCaps/>
-          <w:sz w:val="18"/>
-          <w:szCs w:val="18"/>
-        </w:rPr>
-        <w:t>)</w:t>
-      </w:r>
-      <w:r>
-        <w:rPr>
-          <w:rFonts w:ascii="Arial" w:eastAsia="Arial" w:hAnsi="Arial" w:cs="Arial"/>
-          <w:sz w:val="18"/>
-          <w:szCs w:val="18"/>
-        </w:rPr>
-        <w:t xml:space="preserve"> sendo os responsáveis </w:t>
-      </w:r>
-      <w:proofErr w:type="spellStart"/>
-      <w:r>
-        <w:rPr>
-          <w:rFonts w:ascii="Arial" w:eastAsia="Arial" w:hAnsi="Arial" w:cs="Arial"/>
-          <w:sz w:val="18"/>
-          <w:szCs w:val="18"/>
-        </w:rPr>
-        <w:t>Chrysthian</w:t>
-      </w:r>
-      <w:proofErr w:type="spellEnd"/>
-      <w:r>
-        <w:rPr>
-          <w:rFonts w:ascii="Arial" w:eastAsia="Arial" w:hAnsi="Arial" w:cs="Arial"/>
-          <w:sz w:val="18"/>
-          <w:szCs w:val="18"/>
-        </w:rPr>
-        <w:t xml:space="preserve"> </w:t>
-      </w:r>
-      <w:proofErr w:type="spellStart"/>
-      <w:r>
-        <w:rPr>
-          <w:rFonts w:ascii="Arial" w:eastAsia="Arial" w:hAnsi="Arial" w:cs="Arial"/>
-          <w:sz w:val="18"/>
-          <w:szCs w:val="18"/>
-        </w:rPr>
-        <w:t>Chrisley</w:t>
-      </w:r>
-      <w:proofErr w:type="spellEnd"/>
-      <w:r>
-        <w:rPr>
-          <w:rFonts w:ascii="Arial" w:eastAsia="Arial" w:hAnsi="Arial" w:cs="Arial"/>
-          <w:sz w:val="18"/>
-          <w:szCs w:val="18"/>
-        </w:rPr>
-        <w:t xml:space="preserve"> Tadeu Santos Silva (Mestrando</w:t>
-      </w:r>
-      <w:r>
-        <w:rPr>
-          <w:rFonts w:ascii="Arial" w:eastAsia="Arial" w:hAnsi="Arial" w:cs="Arial"/>
-          <w:sz w:val="18"/>
-          <w:szCs w:val="18"/>
-        </w:rPr>
-        <w:t>)</w:t>
-      </w:r>
-      <w:r>
-        <w:rPr>
-          <w:rFonts w:ascii="Arial" w:eastAsia="Arial" w:hAnsi="Arial" w:cs="Arial"/>
-          <w:sz w:val="18"/>
-          <w:szCs w:val="18"/>
-        </w:rPr>
-        <w:t xml:space="preserve"> e a </w:t>
-      </w:r>
-      <w:r>
-        <w:rPr>
-          <w:rFonts w:ascii="Arial" w:eastAsia="Arial" w:hAnsi="Arial" w:cs="Arial"/>
-          <w:sz w:val="18"/>
-          <w:szCs w:val="18"/>
-        </w:rPr>
-        <w:t>Orientadora</w:t>
-      </w:r>
-      <w:r>
-        <w:t xml:space="preserve"> </w:t>
-      </w:r>
-      <w:r>
-        <w:rPr>
-          <w:rFonts w:ascii="Arial" w:eastAsia="Arial" w:hAnsi="Arial" w:cs="Arial"/>
-          <w:sz w:val="18"/>
-          <w:szCs w:val="18"/>
-        </w:rPr>
-        <w:t>Prof.ª Dra. Rosa Maria Esteves Moreira da Costa</w:t>
-      </w:r>
-      <w:proofErr w:type="gramStart"/>
-      <w:r>
-        <w:t xml:space="preserve"> </w:t>
-      </w:r>
-      <w:r>
-        <w:rPr>
-          <w:rFonts w:ascii="Arial" w:eastAsia="Arial" w:hAnsi="Arial" w:cs="Arial"/>
-          <w:sz w:val="18"/>
-          <w:szCs w:val="18"/>
-        </w:rPr>
-        <w:t xml:space="preserve"> </w:t>
-      </w:r>
-      <w:proofErr w:type="gramEnd"/>
-      <w:r>
-        <w:rPr>
-          <w:rFonts w:ascii="Arial" w:eastAsia="Arial" w:hAnsi="Arial" w:cs="Arial"/>
-          <w:sz w:val="18"/>
-          <w:szCs w:val="18"/>
-        </w:rPr>
-        <w:t>e não nos opomos que a mesma seja realizada. Lembrando que o projeto só poderá começar após avaliação e aprovação do Comitê de Ética em Pesquisa do Hospital Universitário Pedro Ernesto/UERJ.</w:t>
+        <w:t>Declaro para os devidos fins que o Laboratório de Podoposturologia e Confecção de Palmilhas da POLICLÍNICA PIQUET CARNEIRO (PPC) do COMPLEXO HUPE/UERJ, sabe do interesse e estamos de acordo com a condução na realização da Pesquisa: “Arquitetura de baixo custo para monitoramento preventivo do pé diabético: proposta de sistema com sensores e modelo preditivo baseado em Random Forest” sendo os responsáveis Chrysthian Chrisley Tadeu Santos Silva (Mestrando) e a Orientadora Prof.ª Dra. Rosa Maria Esteves Moreira da Costa  e não nos opomos que a mesma seja realizada. Lembrando que o projeto só poderá começar após avaliação e aprovação do Comitê de Ética em Pesquisa do Hospital Universitário Pedro Ernesto/UERJ.</w:t>
       </w:r>
     </w:p>
     <w:p>
@@ -376,51 +160,7 @@
         </w:rPr>
       </w:pPr>
       <w:r>
-        <w:rPr>
-          <w:rFonts w:ascii="Arial" w:eastAsia="Arial" w:hAnsi="Arial" w:cs="Arial"/>
-          <w:color w:val="000000"/>
-          <w:sz w:val="18"/>
-          <w:szCs w:val="18"/>
-        </w:rPr>
-        <w:br/>
-        <w:t xml:space="preserve">Período </w:t>
-      </w:r>
-      <w:r>
-        <w:rPr>
-          <w:rFonts w:ascii="Arial" w:eastAsia="Arial" w:hAnsi="Arial" w:cs="Arial"/>
-          <w:sz w:val="18"/>
-          <w:szCs w:val="18"/>
-        </w:rPr>
-        <w:t>previsto para a</w:t>
-      </w:r>
-      <w:r>
-        <w:rPr>
-          <w:rFonts w:ascii="Arial" w:eastAsia="Arial" w:hAnsi="Arial" w:cs="Arial"/>
-          <w:color w:val="000000"/>
-          <w:sz w:val="18"/>
-          <w:szCs w:val="18"/>
-        </w:rPr>
-        <w:t xml:space="preserve"> coleta dos </w:t>
-      </w:r>
-      <w:proofErr w:type="gramStart"/>
-      <w:r>
-        <w:rPr>
-          <w:rFonts w:ascii="Arial" w:eastAsia="Arial" w:hAnsi="Arial" w:cs="Arial"/>
-          <w:color w:val="000000"/>
-          <w:sz w:val="18"/>
-          <w:szCs w:val="18"/>
-        </w:rPr>
-        <w:t>dados:</w:t>
-      </w:r>
-      <w:proofErr w:type="gramEnd"/>
-      <w:r>
-        <w:rPr>
-          <w:rFonts w:ascii="Arial" w:eastAsia="Arial" w:hAnsi="Arial" w:cs="Arial"/>
-          <w:color w:val="000000"/>
-          <w:sz w:val="18"/>
-          <w:szCs w:val="18"/>
-        </w:rPr>
-        <w:t xml:space="preserve">(__/__/__ à __/__/__) </w:t>
+        <w:t>Período previsto para a coleta dos dados: (01/11/2026 a 28/02/2027)</w:t>
       </w:r>
     </w:p>
     <w:p>
@@ -824,33 +564,11 @@
         </w:rPr>
       </w:pPr>
       <w:r>
-        <w:rPr>
-          <w:rFonts w:ascii="Arial" w:eastAsia="Arial" w:hAnsi="Arial" w:cs="Arial"/>
-          <w:color w:val="000000"/>
-          <w:sz w:val="18"/>
-          <w:szCs w:val="18"/>
-        </w:rPr>
-        <w:t xml:space="preserve">Laboratório de </w:t>
-      </w:r>
-      <w:proofErr w:type="spellStart"/>
-      <w:r>
-        <w:rPr>
-          <w:rFonts w:ascii="Arial" w:eastAsia="Arial" w:hAnsi="Arial" w:cs="Arial"/>
-          <w:color w:val="000000"/>
-          <w:sz w:val="18"/>
-          <w:szCs w:val="18"/>
-        </w:rPr>
-        <w:t>Podoposturologia</w:t>
-      </w:r>
-      <w:proofErr w:type="spellEnd"/>
-      <w:r>
-        <w:rPr>
-          <w:rFonts w:ascii="Arial" w:eastAsia="Arial" w:hAnsi="Arial" w:cs="Arial"/>
-          <w:color w:val="000000"/>
-          <w:sz w:val="18"/>
-          <w:szCs w:val="18"/>
-        </w:rPr>
-        <w:t xml:space="preserve"> e Confecção de Palmilhas da PPC/UERJ</w:t>
+        <w:t>Laboratório de Podoposturologia e Confecção de Palmilhas da PPC/UERJ</w:t>
+        <w:br/>
+        <w:t>Assinatura com Carimbo ou Certificação Digital GOV.BR</w:t>
+        <w:br/>
+        <w:t>Data: _____ / _____ / 2026</w:t>
       </w:r>
     </w:p>
     <w:p>
@@ -1198,30 +916,7 @@
         </w:rPr>
       </w:pPr>
       <w:r>
-        <w:rPr>
-          <w:rFonts w:ascii="Arial" w:eastAsia="Arial" w:hAnsi="Arial" w:cs="Arial"/>
-          <w:color w:val="000000"/>
-          <w:sz w:val="18"/>
-          <w:szCs w:val="18"/>
-        </w:rPr>
-        <w:t xml:space="preserve">Declaro que me responsabilizando pelo andamento, realização e conclusão do projeto, seguir a resolução 466/12 do CNS bem como as complementares, o compromisso no resguardo da segurança e bem-estar dos participantes da pesquisa nela recrutados e comprometendo-me a enviar relatórios a qualquer momento, se o estudo for interrompido e quando da sua conclusão. Comprometo a preservar a privacidade dos participantes e declaro que as informações provenientes da pesquisa serão utilizadas, </w:t>
-      </w:r>
-      <w:r>
-        <w:rPr>
-          <w:rFonts w:ascii="Arial" w:eastAsia="Arial" w:hAnsi="Arial" w:cs="Arial"/>
-          <w:sz w:val="18"/>
-          <w:szCs w:val="18"/>
-        </w:rPr>
-        <w:t>única e exclusivamente</w:t>
-      </w:r>
-      <w:r>
-        <w:rPr>
-          <w:rFonts w:ascii="Arial" w:eastAsia="Arial" w:hAnsi="Arial" w:cs="Arial"/>
-          <w:color w:val="000000"/>
-          <w:sz w:val="18"/>
-          <w:szCs w:val="18"/>
-        </w:rPr>
-        <w:t xml:space="preserve"> para a execução do presente projeto.</w:t>
+        <w:t>Declaramos que nos responsabilizamos pelo andamento, realização e conclusão do projeto, seguir a resolução 466/12 do CNS bem como as complementares, o compromisso no resguardo da segurança e bem-estar dos participantes da pesquisa nela recrutados e comprometendo-me a enviar relatórios a qualquer momento, se o estudo for interrompido e quando da sua conclusão. Comprometo a preservar a privacidade dos participantes e declaro que as informações provenientes da pesquisa serão utilizadas, única e exclusivamente para a execução do presente projeto.</w:t>
       </w:r>
     </w:p>
     <w:p>

</xml_diff>